<commit_message>
Update notebooks, artifacts, and results
</commit_message>
<xml_diff>
--- a/reports/Methodology_Part2_EDA_with_Graphs.docx
+++ b/reports/Methodology_Part2_EDA_with_Graphs.docx
@@ -1605,7 +1605,13 @@
         <w:pStyle w:val="ListBullet"/>
       </w:pPr>
       <w:r>
-        <w:t>Feature engineering: Lagged variables (t-1, t-3, t-6) for energy prices and exchange rates</w:t>
+        <w:t xml:space="preserve">Feature engineering: Lagged variables (t-1, t-3, t-6) for </w:t>
+      </w:r>
+      <w:r>
+        <w:t>cpi ,</w:t>
+      </w:r>
+      <w:r>
+        <w:t>energy prices and exchange rates</w:t>
       </w:r>
     </w:p>
     <w:p>
@@ -1621,7 +1627,7 @@
         <w:pStyle w:val="ListBullet"/>
       </w:pPr>
       <w:r>
-        <w:t>Uncertainty quantification: Probabilistic forecasts rather than point estimates</w:t>
+        <w:t>Explainability mechanisms: SHAP values and attention weights to interpret model decisions</w:t>
       </w:r>
     </w:p>
     <w:p>
@@ -1629,98 +1635,13 @@
         <w:pStyle w:val="ListBullet"/>
       </w:pPr>
       <w:r>
-        <w:t>Explainability mechanisms: SHAP values and attention weights to interpret model decisions</w:t>
-      </w:r>
-    </w:p>
-    <w:p>
-      <w:pPr>
-        <w:pStyle w:val="Heading2"/>
-      </w:pPr>
-      <w:r>
-        <w:t>8.3 Limitations and Future Work</w:t>
-      </w:r>
-    </w:p>
-    <w:p>
-      <w:pPr>
-        <w:jc w:val="both"/>
-      </w:pPr>
-      <w:r>
-        <w:rPr>
-          <w:b/>
-        </w:rPr>
-        <w:t>Data Limitations:</w:t>
-      </w:r>
-      <w:r>
-        <w:rPr>
-          <w:b/>
-        </w:rPr>
-        <w:br/>
-      </w:r>
-    </w:p>
-    <w:p>
-      <w:pPr>
-        <w:pStyle w:val="ListBullet"/>
-      </w:pPr>
-      <w:r>
-        <w:t>Monthly frequency limits short-term nowcasting capabilities</w:t>
-      </w:r>
-    </w:p>
-    <w:p>
-      <w:pPr>
-        <w:pStyle w:val="ListBullet"/>
-      </w:pPr>
-      <w:r>
-        <w:t>Missing variables (e.g., inflation expectations, global supply chain indices) may improve accuracy</w:t>
-      </w:r>
-    </w:p>
-    <w:p>
-      <w:pPr>
-        <w:pStyle w:val="ListBullet"/>
-      </w:pPr>
-      <w:r>
-        <w:t>Recent regime (2022-2023) has limited historical observations for training</w:t>
-      </w:r>
-    </w:p>
-    <w:p>
-      <w:pPr>
-        <w:jc w:val="both"/>
-      </w:pPr>
-      <w:r>
-        <w:rPr>
-          <w:b/>
-        </w:rPr>
-        <w:t>Methodological Extensions:</w:t>
-      </w:r>
-      <w:r>
-        <w:rPr>
-          <w:b/>
-        </w:rPr>
-        <w:br/>
-      </w:r>
-    </w:p>
-    <w:p>
-      <w:pPr>
-        <w:pStyle w:val="ListBullet"/>
-      </w:pPr>
-      <w:r>
-        <w:t>Regime-switching models explicitly modelling structural breaks</w:t>
-      </w:r>
-    </w:p>
-    <w:p>
-      <w:pPr>
-        <w:pStyle w:val="ListBullet"/>
-      </w:pPr>
-      <w:r>
-        <w:t>Incorporation of text data (central bank communications, news sentiment)</w:t>
-      </w:r>
-    </w:p>
-    <w:p>
-      <w:pPr>
-        <w:pStyle w:val="ListBullet"/>
-      </w:pPr>
-      <w:r>
-        <w:lastRenderedPageBreak/>
-        <w:t>Multi-horizon forecasting (1, 3, 6, 12 months ahead)</w:t>
+        <w:t xml:space="preserve">Multi-horizon forecasting (1, 3, </w:t>
+      </w:r>
+      <w:r>
+        <w:t>5</w:t>
+      </w:r>
+      <w:r>
+        <w:t xml:space="preserve"> months ahead)</w:t>
       </w:r>
     </w:p>
     <w:p>
@@ -2254,7 +2175,7 @@
   <w:abstractNum w:abstractNumId="8" w15:restartNumberingAfterBreak="0">
     <w:nsid w:val="FFFFFF89"/>
     <w:multiLevelType w:val="singleLevel"/>
-    <w:tmpl w:val="29761A62"/>
+    <w:tmpl w:val="F6FA84FC"/>
     <w:lvl w:ilvl="0">
       <w:start w:val="1"/>
       <w:numFmt w:val="bullet"/>

</xml_diff>